<commit_message>
docs: replace ASCII diagram with a polished graphical architecture diagram
Colour-coded boxes-and-arrows diagram (architecture.png) embedded in the .docx:
frontend → gateway → 5 services (with their DBs), Keycloak/JWT, OpenFeign (sync),
RabbitMQ (async), Config Server + Eureka, Prometheus/Grafana, plus a legend.

Co-Authored-By: Claude Opus 4.8 <noreply@anthropic.com>
</commit_message>
<xml_diff>
--- a/Gestion_Evenements_Documentation.docx
+++ b/Gestion_Evenements_Documentation.docx
@@ -162,81 +162,42 @@
       </w:r>
     </w:p>
     <w:p>
+      <w:pPr>
+        <w:jc w:val="center"/>
+      </w:pPr>
       <w:r>
-        <w:rPr>
-          <w:rFonts w:ascii="Consolas" w:hAnsi="Consolas"/>
-          <w:sz w:val="17"/>
-        </w:rPr>
-        <w:br/>
-        <w:t xml:space="preserve">                                   +---------------------------+</w:t>
-        <w:br/>
-        <w:t xml:space="preserve">                                   |     Frontend (Angular)    |</w:t>
-        <w:br/>
-        <w:t xml:space="preserve">                                   |     http://localhost:4200 |</w:t>
-        <w:br/>
-        <w:t xml:space="preserve">                                   +-------------+-------------+</w:t>
-        <w:br/>
-        <w:t xml:space="preserve">                                                 |  REST + WebSocket (JWT)</w:t>
-        <w:br/>
-        <w:t xml:space="preserve">                                                 v</w:t>
-        <w:br/>
-        <w:t xml:space="preserve">        +----------------+            +---------------------------+           +-----------------+</w:t>
-        <w:br/>
-        <w:t xml:space="preserve">        |   Keycloak     |&lt;---valide--|      API GATEWAY (9090)   |--metrics-&gt;|  Prometheus     |</w:t>
-        <w:br/>
-        <w:t xml:space="preserve">        |   (JWT / auth) |    JWT     | Spring Cloud Gateway      |           |  (9095)         |</w:t>
-        <w:br/>
-        <w:t xml:space="preserve">        |   :8080        |            | - securite (OAuth2 JWT)   |           +--------+--------+</w:t>
-        <w:br/>
-        <w:t xml:space="preserve">        +----------------+            | - routage /api/**         |                    |</w:t>
-        <w:br/>
-        <w:t xml:space="preserve">                                      | - /socket.io (WebSocket)  |                    v</w:t>
-        <w:br/>
-        <w:t xml:space="preserve">                                      +-----+----+----+----+------+           +-----------------+</w:t>
-        <w:br/>
-        <w:t xml:space="preserve">                                            |    |    |    |    |             |   Grafana (3000)|</w:t>
-        <w:br/>
-        <w:t xml:space="preserve">              lb:// (Eureka)  +-------------+    |    |    |    +---------+   +-----------------+</w:t>
-        <w:br/>
-        <w:t xml:space="preserve">                              |                  |    |    |              |</w:t>
-        <w:br/>
-        <w:t xml:space="preserve">                              v                  v    v    v              v</w:t>
-        <w:br/>
-        <w:t xml:space="preserve">                   +------------------+  +-------------+  +-----------+  +------------------+</w:t>
-        <w:br/>
-        <w:t xml:space="preserve">                   | service-         |  | service-    |  | service-  |  | service-         |</w:t>
-        <w:br/>
-        <w:t xml:space="preserve">                   | utilisateurs 8081|  | evenements  |  | avis 8083 |  | reservation 8084 |</w:t>
-        <w:br/>
-        <w:t xml:space="preserve">                   | MySQL            |  | 8082 MongoDB|  | MySQL     |  | H2 (in-memory)   |</w:t>
-        <w:br/>
-        <w:t xml:space="preserve">                   +--------+---------+  +------+------+  +-----+-----+  +--------+---------+</w:t>
-        <w:br/>
-        <w:t xml:space="preserve">                            |   ^  ^            ^  ^            ^                 |</w:t>
-        <w:br/>
-        <w:t xml:space="preserve">                            |   |  | OpenFeign  |  |  OpenFeign |                 | RabbitMQ</w:t>
-        <w:br/>
-        <w:t xml:space="preserve">                            |   |  +------------+  +------------+                 | publish</w:t>
-        <w:br/>
-        <w:t xml:space="preserve">                            |   +----- OpenFeign (reservations d'un user) -------+ "reservation.created"</w:t>
-        <w:br/>
-        <w:t xml:space="preserve">                            |                                                    v</w:t>
-        <w:br/>
-        <w:t xml:space="preserve">                            |  +----------------+                        +----------------+</w:t>
-        <w:br/>
-        <w:t xml:space="preserve">                            +-&gt;| service-       |   &lt;--- RabbitMQ ---     |   RabbitMQ     |</w:t>
-        <w:br/>
-        <w:t xml:space="preserve">                    consume    | messaging 8085 |   (async events)        |   :5672        |</w:t>
-        <w:br/>
-        <w:t xml:space="preserve">              "reservation.*"  | NestJS + MySQL |                        +----------------+</w:t>
-        <w:br/>
-        <w:t xml:space="preserve">                               | Socket.IO chat |</w:t>
-        <w:br/>
-        <w:t xml:space="preserve">                               +----------------+</w:t>
-        <w:br/>
-        <w:br/>
-        <w:t xml:space="preserve">   Infra transverse : Config Server (8888)  |  Eureka (8761)  |  phpMyAdmin (8090)  |  MySQL (conteneur)</w:t>
-        <w:br/>
+        <w:drawing>
+          <wp:inline xmlns:a="http://schemas.openxmlformats.org/drawingml/2006/main" xmlns:pic="http://schemas.openxmlformats.org/drawingml/2006/picture">
+            <wp:extent cx="6035040" cy="4113136"/>
+            <wp:docPr id="1" name="Picture 1"/>
+            <wp:cNvGraphicFramePr>
+              <a:graphicFrameLocks noChangeAspect="1"/>
+            </wp:cNvGraphicFramePr>
+            <a:graphic>
+              <a:graphicData uri="http://schemas.openxmlformats.org/drawingml/2006/picture">
+                <pic:pic>
+                  <pic:nvPicPr>
+                    <pic:cNvPr id="0" name="architecture.png"/>
+                    <pic:cNvPicPr/>
+                  </pic:nvPicPr>
+                  <pic:blipFill>
+                    <a:blip r:embed="rId9"/>
+                    <a:stretch>
+                      <a:fillRect/>
+                    </a:stretch>
+                  </pic:blipFill>
+                  <pic:spPr>
+                    <a:xfrm>
+                      <a:off x="0" y="0"/>
+                      <a:ext cx="6035040" cy="4113136"/>
+                    </a:xfrm>
+                    <a:prstGeom prst="rect"/>
+                  </pic:spPr>
+                </pic:pic>
+              </a:graphicData>
+            </a:graphic>
+          </wp:inline>
+        </w:drawing>
       </w:r>
     </w:p>
     <w:p>

</xml_diff>